<commit_message>
Ajoute Fine & Gray 1999, Lu et al. 2018, Raab et al. 2020 + biblio a jour (10/13)
</commit_message>
<xml_diff>
--- a/Biblio/Bibliographie_Sujet39.docx
+++ b/Biblio/Bibliographie_Sujet39.docx
@@ -48,7 +48,7 @@
           <w:sz w:val="19"/>
           <w:szCs w:val="19"/>
         </w:rPr>
-        <w:t xml:space="preserve">13 références (10 extraites du sujet officiel, dont 7 cachées derrière des hyperliens du PDF non visibles en texte brut ; 3 supplémentaires trouvées dans le document d'introduction "Le paradoxe du point aveugle"). 7 sont téléchargées et dans ce dossier (3 en libre accès + 4 récupérées via accès institutionnel). Restent 6 à obtenir via le proxy de la bibliothèque CentraleSupélec — Fine &amp; Gray et Raab et al. ont chacun 2 tentatives échouées (voir notes), Bifet &amp; Gavaldà n'a pas encore été tenté, David &amp; Nagaraja et Kalbfleisch &amp; Prentice sont des livres (emprunt bibliothèque, pas un téléchargement).</w:t>
+        <w:t xml:space="preserve">13 références (10 extraites du sujet officiel, dont 7 cachées derrière des hyperliens du PDF non visibles en texte brut ; 3 supplémentaires trouvées dans le document d'introduction "Le paradoxe du point aveugle"). 10 sont téléchargées et dans ce dossier (3 en libre accès + 7 récupérées via accès institutionnel). Ne restent que Bifet &amp; Gavaldà (pas encore tenté) et deux ouvrages (David &amp; Nagaraja, Kalbfleisch &amp; Prentice) qui demandent un emprunt bibliothèque plutôt qu'un téléchargement.</w:t>
       </w:r>
     </w:p>
     <w:tbl>
@@ -435,6 +435,282 @@
               <w:rPr>
                 <w:b/>
                 <w:bCs/>
+                <w:color w:val="1B7A3C"/>
+                <w:sz w:val="19"/>
+                <w:szCs w:val="19"/>
+              </w:rPr>
+              <w:t xml:space="preserve">✓ Téléchargé</w:t>
+            </w:r>
+          </w:p>
+        </w:tc>
+      </w:tr>
+      <w:tr>
+        <w:tc>
+          <w:tcPr>
+            <w:tcW w:type="dxa" w:w="500"/>
+            <w:tcMar>
+              <w:top w:type="dxa" w:w="100"/>
+              <w:left w:type="dxa" w:w="120"/>
+              <w:bottom w:type="dxa" w:w="100"/>
+              <w:right w:type="dxa" w:w="120"/>
+            </w:tcMar>
+          </w:tcPr>
+          <w:p>
+            <w:r>
+              <w:rPr>
+                <w:b/>
+                <w:bCs/>
+                <w:sz w:val="20"/>
+                <w:szCs w:val="20"/>
+              </w:rPr>
+              <w:t xml:space="preserve">2</w:t>
+            </w:r>
+          </w:p>
+        </w:tc>
+        <w:tc>
+          <w:tcPr>
+            <w:tcW w:type="dxa" w:w="4200"/>
+            <w:tcMar>
+              <w:top w:type="dxa" w:w="100"/>
+              <w:left w:type="dxa" w:w="120"/>
+              <w:bottom w:type="dxa" w:w="100"/>
+              <w:right w:type="dxa" w:w="120"/>
+            </w:tcMar>
+          </w:tcPr>
+          <w:p>
+            <w:pPr>
+              <w:spacing w:after="60"/>
+            </w:pPr>
+            <w:r>
+              <w:rPr>
+                <w:b/>
+                <w:bCs/>
+                <w:sz w:val="19"/>
+                <w:szCs w:val="19"/>
+              </w:rPr>
+              <w:t xml:space="preserve">Page, E.S. (1954)</w:t>
+            </w:r>
+          </w:p>
+          <w:p>
+            <w:pPr>
+              <w:spacing w:after="60"/>
+            </w:pPr>
+            <w:r>
+              <w:rPr>
+                <w:b w:val="false"/>
+                <w:bCs w:val="false"/>
+                <w:sz w:val="19"/>
+                <w:szCs w:val="19"/>
+              </w:rPr>
+              <w:t xml:space="preserve">Continuous Inspection Schemes.</w:t>
+            </w:r>
+          </w:p>
+          <w:p>
+            <w:pPr>
+              <w:spacing w:after="60"/>
+            </w:pPr>
+            <w:r>
+              <w:rPr>
+                <w:b w:val="false"/>
+                <w:bCs w:val="false"/>
+                <w:sz w:val="19"/>
+                <w:szCs w:val="19"/>
+              </w:rPr>
+              <w:t xml:space="preserve">Biometrika, 41(1-2), 100–115.</w:t>
+            </w:r>
+          </w:p>
+        </w:tc>
+        <w:tc>
+          <w:tcPr>
+            <w:tcW w:type="dxa" w:w="3050"/>
+            <w:tcMar>
+              <w:top w:type="dxa" w:w="100"/>
+              <w:left w:type="dxa" w:w="120"/>
+              <w:bottom w:type="dxa" w:w="100"/>
+              <w:right w:type="dxa" w:w="120"/>
+            </w:tcMar>
+          </w:tcPr>
+          <w:p>
+            <w:pPr>
+              <w:spacing w:after="60"/>
+            </w:pPr>
+            <w:r>
+              <w:rPr>
+                <w:sz w:val="19"/>
+                <w:szCs w:val="19"/>
+              </w:rPr>
+              <w:t xml:space="preserve">Papier original du test CUSUM / Page-Hinkley,</w:t>
+            </w:r>
+          </w:p>
+          <w:p>
+            <w:pPr>
+              <w:spacing w:after="60"/>
+            </w:pPr>
+            <w:r>
+              <w:rPr>
+                <w:sz w:val="19"/>
+                <w:szCs w:val="19"/>
+              </w:rPr>
+              <w:t xml:space="preserve">le détecteur externe du système.</w:t>
+            </w:r>
+          </w:p>
+        </w:tc>
+        <w:tc>
+          <w:tcPr>
+            <w:tcW w:type="dxa" w:w="1600"/>
+            <w:tcMar>
+              <w:top w:type="dxa" w:w="100"/>
+              <w:left w:type="dxa" w:w="120"/>
+              <w:bottom w:type="dxa" w:w="100"/>
+              <w:right w:type="dxa" w:w="120"/>
+            </w:tcMar>
+          </w:tcPr>
+          <w:p>
+            <w:pPr>
+              <w:spacing w:after="60"/>
+            </w:pPr>
+            <w:r>
+              <w:rPr>
+                <w:b/>
+                <w:bCs/>
+                <w:color w:val="1B7A3C"/>
+                <w:sz w:val="19"/>
+                <w:szCs w:val="19"/>
+              </w:rPr>
+              <w:t xml:space="preserve">✓ Téléchargé</w:t>
+            </w:r>
+          </w:p>
+        </w:tc>
+      </w:tr>
+      <w:tr>
+        <w:tc>
+          <w:tcPr>
+            <w:tcW w:type="dxa" w:w="500"/>
+            <w:tcMar>
+              <w:top w:type="dxa" w:w="100"/>
+              <w:left w:type="dxa" w:w="120"/>
+              <w:bottom w:type="dxa" w:w="100"/>
+              <w:right w:type="dxa" w:w="120"/>
+            </w:tcMar>
+          </w:tcPr>
+          <w:p>
+            <w:r>
+              <w:rPr>
+                <w:b/>
+                <w:bCs/>
+                <w:sz w:val="20"/>
+                <w:szCs w:val="20"/>
+              </w:rPr>
+              <w:t xml:space="preserve">3</w:t>
+            </w:r>
+          </w:p>
+        </w:tc>
+        <w:tc>
+          <w:tcPr>
+            <w:tcW w:type="dxa" w:w="4200"/>
+            <w:tcMar>
+              <w:top w:type="dxa" w:w="100"/>
+              <w:left w:type="dxa" w:w="120"/>
+              <w:bottom w:type="dxa" w:w="100"/>
+              <w:right w:type="dxa" w:w="120"/>
+            </w:tcMar>
+          </w:tcPr>
+          <w:p>
+            <w:pPr>
+              <w:spacing w:after="60"/>
+            </w:pPr>
+            <w:r>
+              <w:rPr>
+                <w:b/>
+                <w:bCs/>
+                <w:sz w:val="19"/>
+                <w:szCs w:val="19"/>
+              </w:rPr>
+              <w:t xml:space="preserve">Bifet, A. &amp; Gavaldà, R. (2007)</w:t>
+            </w:r>
+          </w:p>
+          <w:p>
+            <w:pPr>
+              <w:spacing w:after="60"/>
+            </w:pPr>
+            <w:r>
+              <w:rPr>
+                <w:b w:val="false"/>
+                <w:bCs w:val="false"/>
+                <w:sz w:val="19"/>
+                <w:szCs w:val="19"/>
+              </w:rPr>
+              <w:t xml:space="preserve">Learning from Time-Changing Data with Adaptive</w:t>
+            </w:r>
+          </w:p>
+          <w:p>
+            <w:pPr>
+              <w:spacing w:after="60"/>
+            </w:pPr>
+            <w:r>
+              <w:rPr>
+                <w:b w:val="false"/>
+                <w:bCs w:val="false"/>
+                <w:sz w:val="19"/>
+                <w:szCs w:val="19"/>
+              </w:rPr>
+              <w:t xml:space="preserve">Windowing. SIAM ICDM 2007, 443–448.</w:t>
+            </w:r>
+          </w:p>
+        </w:tc>
+        <w:tc>
+          <w:tcPr>
+            <w:tcW w:type="dxa" w:w="3050"/>
+            <w:tcMar>
+              <w:top w:type="dxa" w:w="100"/>
+              <w:left w:type="dxa" w:w="120"/>
+              <w:bottom w:type="dxa" w:w="100"/>
+              <w:right w:type="dxa" w:w="120"/>
+            </w:tcMar>
+          </w:tcPr>
+          <w:p>
+            <w:pPr>
+              <w:spacing w:after="60"/>
+            </w:pPr>
+            <w:r>
+              <w:rPr>
+                <w:sz w:val="19"/>
+                <w:szCs w:val="19"/>
+              </w:rPr>
+              <w:t xml:space="preserve">Papier fondateur d'ADWIN, la fenêtre glissante</w:t>
+            </w:r>
+          </w:p>
+          <w:p>
+            <w:pPr>
+              <w:spacing w:after="60"/>
+            </w:pPr>
+            <w:r>
+              <w:rPr>
+                <w:sz w:val="19"/>
+                <w:szCs w:val="19"/>
+              </w:rPr>
+              <w:t xml:space="preserve">utilisée par l'Adaptive Random Forest pour se réparer.</w:t>
+            </w:r>
+          </w:p>
+        </w:tc>
+        <w:tc>
+          <w:tcPr>
+            <w:tcW w:type="dxa" w:w="1600"/>
+            <w:tcMar>
+              <w:top w:type="dxa" w:w="100"/>
+              <w:left w:type="dxa" w:w="120"/>
+              <w:bottom w:type="dxa" w:w="100"/>
+              <w:right w:type="dxa" w:w="120"/>
+            </w:tcMar>
+          </w:tcPr>
+          <w:p>
+            <w:pPr>
+              <w:spacing w:after="60"/>
+            </w:pPr>
+            <w:r>
+              <w:rPr>
+                <w:b/>
+                <w:bCs/>
                 <w:color w:val="B03A2E"/>
                 <w:sz w:val="19"/>
                 <w:szCs w:val="19"/>
@@ -449,309 +725,10 @@
                 <w:sz w:val="17"/>
                 <w:szCs w:val="17"/>
               </w:rPr>
-              <w:t xml:space="preserve">Tentative échouée : eReader JS
-(Taylor &amp; Francis), aucun texte
-récupérable. Réessayer avec
-"Télécharger le PDF" et non
-"Enregistrer la page".
-</w:t>
-            </w:r>
-            <w:hyperlink w:history="1" r:id="rIdwyzpwr1sb-rr5mpobpqqq">
-              <w:r>
-                <w:rPr>
-                  <w:rStyle w:val="Hyperlink"/>
-                </w:rPr>
-                <w:t xml:space="preserve">https://doi.org/10.1080/01621459.1999.10474144</w:t>
-              </w:r>
-            </w:hyperlink>
-          </w:p>
-        </w:tc>
-      </w:tr>
-      <w:tr>
-        <w:tc>
-          <w:tcPr>
-            <w:tcW w:type="dxa" w:w="500"/>
-            <w:tcMar>
-              <w:top w:type="dxa" w:w="100"/>
-              <w:left w:type="dxa" w:w="120"/>
-              <w:bottom w:type="dxa" w:w="100"/>
-              <w:right w:type="dxa" w:w="120"/>
-            </w:tcMar>
-          </w:tcPr>
-          <w:p>
-            <w:r>
-              <w:rPr>
-                <w:b/>
-                <w:bCs/>
-                <w:sz w:val="20"/>
-                <w:szCs w:val="20"/>
-              </w:rPr>
-              <w:t xml:space="preserve">2</w:t>
-            </w:r>
-          </w:p>
-        </w:tc>
-        <w:tc>
-          <w:tcPr>
-            <w:tcW w:type="dxa" w:w="4200"/>
-            <w:tcMar>
-              <w:top w:type="dxa" w:w="100"/>
-              <w:left w:type="dxa" w:w="120"/>
-              <w:bottom w:type="dxa" w:w="100"/>
-              <w:right w:type="dxa" w:w="120"/>
-            </w:tcMar>
-          </w:tcPr>
-          <w:p>
-            <w:pPr>
-              <w:spacing w:after="60"/>
-            </w:pPr>
-            <w:r>
-              <w:rPr>
-                <w:b/>
-                <w:bCs/>
-                <w:sz w:val="19"/>
-                <w:szCs w:val="19"/>
-              </w:rPr>
-              <w:t xml:space="preserve">Page, E.S. (1954)</w:t>
-            </w:r>
-          </w:p>
-          <w:p>
-            <w:pPr>
-              <w:spacing w:after="60"/>
-            </w:pPr>
-            <w:r>
-              <w:rPr>
-                <w:b w:val="false"/>
-                <w:bCs w:val="false"/>
-                <w:sz w:val="19"/>
-                <w:szCs w:val="19"/>
-              </w:rPr>
-              <w:t xml:space="preserve">Continuous Inspection Schemes.</w:t>
-            </w:r>
-          </w:p>
-          <w:p>
-            <w:pPr>
-              <w:spacing w:after="60"/>
-            </w:pPr>
-            <w:r>
-              <w:rPr>
-                <w:b w:val="false"/>
-                <w:bCs w:val="false"/>
-                <w:sz w:val="19"/>
-                <w:szCs w:val="19"/>
-              </w:rPr>
-              <w:t xml:space="preserve">Biometrika, 41(1-2), 100–115.</w:t>
-            </w:r>
-          </w:p>
-        </w:tc>
-        <w:tc>
-          <w:tcPr>
-            <w:tcW w:type="dxa" w:w="3050"/>
-            <w:tcMar>
-              <w:top w:type="dxa" w:w="100"/>
-              <w:left w:type="dxa" w:w="120"/>
-              <w:bottom w:type="dxa" w:w="100"/>
-              <w:right w:type="dxa" w:w="120"/>
-            </w:tcMar>
-          </w:tcPr>
-          <w:p>
-            <w:pPr>
-              <w:spacing w:after="60"/>
-            </w:pPr>
-            <w:r>
-              <w:rPr>
-                <w:sz w:val="19"/>
-                <w:szCs w:val="19"/>
-              </w:rPr>
-              <w:t xml:space="preserve">Papier original du test CUSUM / Page-Hinkley,</w:t>
-            </w:r>
-          </w:p>
-          <w:p>
-            <w:pPr>
-              <w:spacing w:after="60"/>
-            </w:pPr>
-            <w:r>
-              <w:rPr>
-                <w:sz w:val="19"/>
-                <w:szCs w:val="19"/>
-              </w:rPr>
-              <w:t xml:space="preserve">le détecteur externe du système.</w:t>
-            </w:r>
-          </w:p>
-        </w:tc>
-        <w:tc>
-          <w:tcPr>
-            <w:tcW w:type="dxa" w:w="1600"/>
-            <w:tcMar>
-              <w:top w:type="dxa" w:w="100"/>
-              <w:left w:type="dxa" w:w="120"/>
-              <w:bottom w:type="dxa" w:w="100"/>
-              <w:right w:type="dxa" w:w="120"/>
-            </w:tcMar>
-          </w:tcPr>
-          <w:p>
-            <w:pPr>
-              <w:spacing w:after="60"/>
-            </w:pPr>
-            <w:r>
-              <w:rPr>
-                <w:b/>
-                <w:bCs/>
-                <w:color w:val="1B7A3C"/>
-                <w:sz w:val="19"/>
-                <w:szCs w:val="19"/>
-              </w:rPr>
-              <w:t xml:space="preserve">✓ Téléchargé</w:t>
-            </w:r>
-          </w:p>
-        </w:tc>
-      </w:tr>
-      <w:tr>
-        <w:tc>
-          <w:tcPr>
-            <w:tcW w:type="dxa" w:w="500"/>
-            <w:tcMar>
-              <w:top w:type="dxa" w:w="100"/>
-              <w:left w:type="dxa" w:w="120"/>
-              <w:bottom w:type="dxa" w:w="100"/>
-              <w:right w:type="dxa" w:w="120"/>
-            </w:tcMar>
-          </w:tcPr>
-          <w:p>
-            <w:r>
-              <w:rPr>
-                <w:b/>
-                <w:bCs/>
-                <w:sz w:val="20"/>
-                <w:szCs w:val="20"/>
-              </w:rPr>
-              <w:t xml:space="preserve">3</w:t>
-            </w:r>
-          </w:p>
-        </w:tc>
-        <w:tc>
-          <w:tcPr>
-            <w:tcW w:type="dxa" w:w="4200"/>
-            <w:tcMar>
-              <w:top w:type="dxa" w:w="100"/>
-              <w:left w:type="dxa" w:w="120"/>
-              <w:bottom w:type="dxa" w:w="100"/>
-              <w:right w:type="dxa" w:w="120"/>
-            </w:tcMar>
-          </w:tcPr>
-          <w:p>
-            <w:pPr>
-              <w:spacing w:after="60"/>
-            </w:pPr>
-            <w:r>
-              <w:rPr>
-                <w:b/>
-                <w:bCs/>
-                <w:sz w:val="19"/>
-                <w:szCs w:val="19"/>
-              </w:rPr>
-              <w:t xml:space="preserve">Bifet, A. &amp; Gavaldà, R. (2007)</w:t>
-            </w:r>
-          </w:p>
-          <w:p>
-            <w:pPr>
-              <w:spacing w:after="60"/>
-            </w:pPr>
-            <w:r>
-              <w:rPr>
-                <w:b w:val="false"/>
-                <w:bCs w:val="false"/>
-                <w:sz w:val="19"/>
-                <w:szCs w:val="19"/>
-              </w:rPr>
-              <w:t xml:space="preserve">Learning from Time-Changing Data with Adaptive</w:t>
-            </w:r>
-          </w:p>
-          <w:p>
-            <w:pPr>
-              <w:spacing w:after="60"/>
-            </w:pPr>
-            <w:r>
-              <w:rPr>
-                <w:b w:val="false"/>
-                <w:bCs w:val="false"/>
-                <w:sz w:val="19"/>
-                <w:szCs w:val="19"/>
-              </w:rPr>
-              <w:t xml:space="preserve">Windowing. SIAM ICDM 2007, 443–448.</w:t>
-            </w:r>
-          </w:p>
-        </w:tc>
-        <w:tc>
-          <w:tcPr>
-            <w:tcW w:type="dxa" w:w="3050"/>
-            <w:tcMar>
-              <w:top w:type="dxa" w:w="100"/>
-              <w:left w:type="dxa" w:w="120"/>
-              <w:bottom w:type="dxa" w:w="100"/>
-              <w:right w:type="dxa" w:w="120"/>
-            </w:tcMar>
-          </w:tcPr>
-          <w:p>
-            <w:pPr>
-              <w:spacing w:after="60"/>
-            </w:pPr>
-            <w:r>
-              <w:rPr>
-                <w:sz w:val="19"/>
-                <w:szCs w:val="19"/>
-              </w:rPr>
-              <w:t xml:space="preserve">Papier fondateur d'ADWIN, la fenêtre glissante</w:t>
-            </w:r>
-          </w:p>
-          <w:p>
-            <w:pPr>
-              <w:spacing w:after="60"/>
-            </w:pPr>
-            <w:r>
-              <w:rPr>
-                <w:sz w:val="19"/>
-                <w:szCs w:val="19"/>
-              </w:rPr>
-              <w:t xml:space="preserve">utilisée par l'Adaptive Random Forest pour se réparer.</w:t>
-            </w:r>
-          </w:p>
-        </w:tc>
-        <w:tc>
-          <w:tcPr>
-            <w:tcW w:type="dxa" w:w="1600"/>
-            <w:tcMar>
-              <w:top w:type="dxa" w:w="100"/>
-              <w:left w:type="dxa" w:w="120"/>
-              <w:bottom w:type="dxa" w:w="100"/>
-              <w:right w:type="dxa" w:w="120"/>
-            </w:tcMar>
-          </w:tcPr>
-          <w:p>
-            <w:pPr>
-              <w:spacing w:after="60"/>
-            </w:pPr>
-            <w:r>
-              <w:rPr>
-                <w:b/>
-                <w:bCs/>
-                <w:color w:val="B03A2E"/>
-                <w:sz w:val="19"/>
-                <w:szCs w:val="19"/>
-              </w:rPr>
-              <w:t xml:space="preserve">Payant — via BU
-</w:t>
-            </w:r>
-            <w:r>
-              <w:rPr>
-                <w:i/>
-                <w:iCs/>
-                <w:sz w:val="17"/>
-                <w:szCs w:val="17"/>
-              </w:rPr>
               <w:t xml:space="preserve">Pas encore tenté.
 </w:t>
             </w:r>
-            <w:hyperlink w:history="1" r:id="rId1znwtrn3u9nhfbm6lbbqo">
+            <w:hyperlink w:history="1" r:id="rIdclwskvpcx-u_-q7b8vc8c">
               <w:r>
                 <w:rPr>
                   <w:rStyle w:val="Hyperlink"/>
@@ -1167,6 +1144,556 @@
               <w:rPr>
                 <w:b/>
                 <w:bCs/>
+                <w:color w:val="1B7A3C"/>
+                <w:sz w:val="19"/>
+                <w:szCs w:val="19"/>
+              </w:rPr>
+              <w:t xml:space="preserve">✓ Téléchargé</w:t>
+            </w:r>
+          </w:p>
+        </w:tc>
+      </w:tr>
+      <w:tr>
+        <w:tc>
+          <w:tcPr>
+            <w:tcW w:type="dxa" w:w="500"/>
+            <w:tcMar>
+              <w:top w:type="dxa" w:w="100"/>
+              <w:left w:type="dxa" w:w="120"/>
+              <w:bottom w:type="dxa" w:w="100"/>
+              <w:right w:type="dxa" w:w="120"/>
+            </w:tcMar>
+          </w:tcPr>
+          <w:p>
+            <w:r>
+              <w:rPr>
+                <w:b/>
+                <w:bCs/>
+                <w:sz w:val="20"/>
+                <w:szCs w:val="20"/>
+              </w:rPr>
+              <w:t xml:space="preserve">7</w:t>
+            </w:r>
+          </w:p>
+        </w:tc>
+        <w:tc>
+          <w:tcPr>
+            <w:tcW w:type="dxa" w:w="4200"/>
+            <w:tcMar>
+              <w:top w:type="dxa" w:w="100"/>
+              <w:left w:type="dxa" w:w="120"/>
+              <w:bottom w:type="dxa" w:w="100"/>
+              <w:right w:type="dxa" w:w="120"/>
+            </w:tcMar>
+          </w:tcPr>
+          <w:p>
+            <w:pPr>
+              <w:spacing w:after="60"/>
+            </w:pPr>
+            <w:r>
+              <w:rPr>
+                <w:b/>
+                <w:bCs/>
+                <w:sz w:val="19"/>
+                <w:szCs w:val="19"/>
+              </w:rPr>
+              <w:t xml:space="preserve">Raab, C., Heusinger, M. &amp; Schleif, F.-M. (2020)</w:t>
+            </w:r>
+          </w:p>
+          <w:p>
+            <w:pPr>
+              <w:spacing w:after="60"/>
+            </w:pPr>
+            <w:r>
+              <w:rPr>
+                <w:b w:val="false"/>
+                <w:bCs w:val="false"/>
+                <w:sz w:val="19"/>
+                <w:szCs w:val="19"/>
+              </w:rPr>
+              <w:t xml:space="preserve">Reactive Soft Prototype Computing for Concept Drift</w:t>
+            </w:r>
+          </w:p>
+          <w:p>
+            <w:pPr>
+              <w:spacing w:after="60"/>
+            </w:pPr>
+            <w:r>
+              <w:rPr>
+                <w:b w:val="false"/>
+                <w:bCs w:val="false"/>
+                <w:sz w:val="19"/>
+                <w:szCs w:val="19"/>
+              </w:rPr>
+              <w:t xml:space="preserve">Streams. Neurocomputing, 416, 340–351.</w:t>
+            </w:r>
+          </w:p>
+        </w:tc>
+        <w:tc>
+          <w:tcPr>
+            <w:tcW w:type="dxa" w:w="3050"/>
+            <w:tcMar>
+              <w:top w:type="dxa" w:w="100"/>
+              <w:left w:type="dxa" w:w="120"/>
+              <w:bottom w:type="dxa" w:w="100"/>
+              <w:right w:type="dxa" w:w="120"/>
+            </w:tcMar>
+          </w:tcPr>
+          <w:p>
+            <w:pPr>
+              <w:spacing w:after="60"/>
+            </w:pPr>
+            <w:r>
+              <w:rPr>
+                <w:sz w:val="19"/>
+                <w:szCs w:val="19"/>
+              </w:rPr>
+              <w:t xml:space="preserve">Méthode alternative de gestion du drift.</w:t>
+            </w:r>
+          </w:p>
+          <w:p>
+            <w:pPr>
+              <w:spacing w:after="60"/>
+            </w:pPr>
+            <w:r>
+              <w:rPr>
+                <w:sz w:val="19"/>
+                <w:szCs w:val="19"/>
+              </w:rPr>
+              <w:t xml:space="preserve">Contexte / comparaison possible, non critique.</w:t>
+            </w:r>
+          </w:p>
+        </w:tc>
+        <w:tc>
+          <w:tcPr>
+            <w:tcW w:type="dxa" w:w="1600"/>
+            <w:tcMar>
+              <w:top w:type="dxa" w:w="100"/>
+              <w:left w:type="dxa" w:w="120"/>
+              <w:bottom w:type="dxa" w:w="100"/>
+              <w:right w:type="dxa" w:w="120"/>
+            </w:tcMar>
+          </w:tcPr>
+          <w:p>
+            <w:pPr>
+              <w:spacing w:after="60"/>
+            </w:pPr>
+            <w:r>
+              <w:rPr>
+                <w:b/>
+                <w:bCs/>
+                <w:color w:val="1B7A3C"/>
+                <w:sz w:val="19"/>
+                <w:szCs w:val="19"/>
+              </w:rPr>
+              <w:t xml:space="preserve">✓ Téléchargé</w:t>
+            </w:r>
+          </w:p>
+        </w:tc>
+      </w:tr>
+      <w:tr>
+        <w:tc>
+          <w:tcPr>
+            <w:tcW w:type="dxa" w:w="500"/>
+            <w:tcMar>
+              <w:top w:type="dxa" w:w="100"/>
+              <w:left w:type="dxa" w:w="120"/>
+              <w:bottom w:type="dxa" w:w="100"/>
+              <w:right w:type="dxa" w:w="120"/>
+            </w:tcMar>
+          </w:tcPr>
+          <w:p>
+            <w:r>
+              <w:rPr>
+                <w:b/>
+                <w:bCs/>
+                <w:sz w:val="20"/>
+                <w:szCs w:val="20"/>
+              </w:rPr>
+              <w:t xml:space="preserve">8</w:t>
+            </w:r>
+          </w:p>
+        </w:tc>
+        <w:tc>
+          <w:tcPr>
+            <w:tcW w:type="dxa" w:w="4200"/>
+            <w:tcMar>
+              <w:top w:type="dxa" w:w="100"/>
+              <w:left w:type="dxa" w:w="120"/>
+              <w:bottom w:type="dxa" w:w="100"/>
+              <w:right w:type="dxa" w:w="120"/>
+            </w:tcMar>
+          </w:tcPr>
+          <w:p>
+            <w:pPr>
+              <w:spacing w:after="60"/>
+            </w:pPr>
+            <w:r>
+              <w:rPr>
+                <w:b/>
+                <w:bCs/>
+                <w:sz w:val="19"/>
+                <w:szCs w:val="19"/>
+              </w:rPr>
+              <w:t xml:space="preserve">Montiel, J. et al. (2021)</w:t>
+            </w:r>
+          </w:p>
+          <w:p>
+            <w:pPr>
+              <w:spacing w:after="60"/>
+            </w:pPr>
+            <w:r>
+              <w:rPr>
+                <w:b w:val="false"/>
+                <w:bCs w:val="false"/>
+                <w:sz w:val="19"/>
+                <w:szCs w:val="19"/>
+              </w:rPr>
+              <w:t xml:space="preserve">River: machine learning for streaming data in Python.</w:t>
+            </w:r>
+          </w:p>
+          <w:p>
+            <w:pPr>
+              <w:spacing w:after="60"/>
+            </w:pPr>
+            <w:r>
+              <w:rPr>
+                <w:b w:val="false"/>
+                <w:bCs w:val="false"/>
+                <w:sz w:val="19"/>
+                <w:szCs w:val="19"/>
+              </w:rPr>
+              <w:t xml:space="preserve">JMLR, 22.</w:t>
+            </w:r>
+          </w:p>
+        </w:tc>
+        <w:tc>
+          <w:tcPr>
+            <w:tcW w:type="dxa" w:w="3050"/>
+            <w:tcMar>
+              <w:top w:type="dxa" w:w="100"/>
+              <w:left w:type="dxa" w:w="120"/>
+              <w:bottom w:type="dxa" w:w="100"/>
+              <w:right w:type="dxa" w:w="120"/>
+            </w:tcMar>
+          </w:tcPr>
+          <w:p>
+            <w:pPr>
+              <w:spacing w:after="60"/>
+            </w:pPr>
+            <w:r>
+              <w:rPr>
+                <w:sz w:val="19"/>
+                <w:szCs w:val="19"/>
+              </w:rPr>
+              <w:t xml:space="preserve">Documentation de la librairie River,</w:t>
+            </w:r>
+          </w:p>
+          <w:p>
+            <w:pPr>
+              <w:spacing w:after="60"/>
+            </w:pPr>
+            <w:r>
+              <w:rPr>
+                <w:sz w:val="19"/>
+                <w:szCs w:val="19"/>
+              </w:rPr>
+              <w:t xml:space="preserve">outil imposé pour l'implémentation.</w:t>
+            </w:r>
+          </w:p>
+        </w:tc>
+        <w:tc>
+          <w:tcPr>
+            <w:tcW w:type="dxa" w:w="1600"/>
+            <w:tcMar>
+              <w:top w:type="dxa" w:w="100"/>
+              <w:left w:type="dxa" w:w="120"/>
+              <w:bottom w:type="dxa" w:w="100"/>
+              <w:right w:type="dxa" w:w="120"/>
+            </w:tcMar>
+          </w:tcPr>
+          <w:p>
+            <w:pPr>
+              <w:spacing w:after="60"/>
+            </w:pPr>
+            <w:r>
+              <w:rPr>
+                <w:b/>
+                <w:bCs/>
+                <w:color w:val="1B7A3C"/>
+                <w:sz w:val="19"/>
+                <w:szCs w:val="19"/>
+              </w:rPr>
+              <w:t xml:space="preserve">✓ Téléchargé</w:t>
+            </w:r>
+          </w:p>
+        </w:tc>
+      </w:tr>
+      <w:tr>
+        <w:tc>
+          <w:tcPr>
+            <w:tcW w:type="dxa" w:w="500"/>
+            <w:tcMar>
+              <w:top w:type="dxa" w:w="100"/>
+              <w:left w:type="dxa" w:w="120"/>
+              <w:bottom w:type="dxa" w:w="100"/>
+              <w:right w:type="dxa" w:w="120"/>
+            </w:tcMar>
+          </w:tcPr>
+          <w:p>
+            <w:r>
+              <w:rPr>
+                <w:b/>
+                <w:bCs/>
+                <w:sz w:val="20"/>
+                <w:szCs w:val="20"/>
+              </w:rPr>
+              <w:t xml:space="preserve">9</w:t>
+            </w:r>
+          </w:p>
+        </w:tc>
+        <w:tc>
+          <w:tcPr>
+            <w:tcW w:type="dxa" w:w="4200"/>
+            <w:tcMar>
+              <w:top w:type="dxa" w:w="100"/>
+              <w:left w:type="dxa" w:w="120"/>
+              <w:bottom w:type="dxa" w:w="100"/>
+              <w:right w:type="dxa" w:w="120"/>
+            </w:tcMar>
+          </w:tcPr>
+          <w:p>
+            <w:pPr>
+              <w:spacing w:after="60"/>
+            </w:pPr>
+            <w:r>
+              <w:rPr>
+                <w:b/>
+                <w:bCs/>
+                <w:sz w:val="19"/>
+                <w:szCs w:val="19"/>
+              </w:rPr>
+              <w:t xml:space="preserve">ProteuS (2025)</w:t>
+            </w:r>
+          </w:p>
+          <w:p>
+            <w:pPr>
+              <w:spacing w:after="60"/>
+            </w:pPr>
+            <w:r>
+              <w:rPr>
+                <w:b w:val="false"/>
+                <w:bCs w:val="false"/>
+                <w:sz w:val="19"/>
+                <w:szCs w:val="19"/>
+              </w:rPr>
+              <w:t xml:space="preserve">A Generative Approach for Simulating Concept Drift</w:t>
+            </w:r>
+          </w:p>
+          <w:p>
+            <w:pPr>
+              <w:spacing w:after="60"/>
+            </w:pPr>
+            <w:r>
+              <w:rPr>
+                <w:b w:val="false"/>
+                <w:bCs w:val="false"/>
+                <w:sz w:val="19"/>
+                <w:szCs w:val="19"/>
+              </w:rPr>
+              <w:t xml:space="preserve">in Financial Markets. arXiv:2509.11844.</w:t>
+            </w:r>
+          </w:p>
+        </w:tc>
+        <w:tc>
+          <w:tcPr>
+            <w:tcW w:type="dxa" w:w="3050"/>
+            <w:tcMar>
+              <w:top w:type="dxa" w:w="100"/>
+              <w:left w:type="dxa" w:w="120"/>
+              <w:bottom w:type="dxa" w:w="100"/>
+              <w:right w:type="dxa" w:w="120"/>
+            </w:tcMar>
+          </w:tcPr>
+          <w:p>
+            <w:pPr>
+              <w:spacing w:after="60"/>
+            </w:pPr>
+            <w:r>
+              <w:rPr>
+                <w:sz w:val="19"/>
+                <w:szCs w:val="19"/>
+              </w:rPr>
+              <w:t xml:space="preserve">Le générateur synthétique financier cité dans l'énoncé —</w:t>
+            </w:r>
+          </w:p>
+          <w:p>
+            <w:pPr>
+              <w:spacing w:after="60"/>
+            </w:pPr>
+            <w:r>
+              <w:rPr>
+                <w:sz w:val="19"/>
+                <w:szCs w:val="19"/>
+              </w:rPr>
+              <w:t xml:space="preserve">sert à tester le système sur des ruptures de régime connues.</w:t>
+            </w:r>
+          </w:p>
+        </w:tc>
+        <w:tc>
+          <w:tcPr>
+            <w:tcW w:type="dxa" w:w="1600"/>
+            <w:tcMar>
+              <w:top w:type="dxa" w:w="100"/>
+              <w:left w:type="dxa" w:w="120"/>
+              <w:bottom w:type="dxa" w:w="100"/>
+              <w:right w:type="dxa" w:w="120"/>
+            </w:tcMar>
+          </w:tcPr>
+          <w:p>
+            <w:pPr>
+              <w:spacing w:after="60"/>
+            </w:pPr>
+            <w:r>
+              <w:rPr>
+                <w:b/>
+                <w:bCs/>
+                <w:color w:val="1B7A3C"/>
+                <w:sz w:val="19"/>
+                <w:szCs w:val="19"/>
+              </w:rPr>
+              <w:t xml:space="preserve">✓ Téléchargé</w:t>
+            </w:r>
+          </w:p>
+        </w:tc>
+      </w:tr>
+      <w:tr>
+        <w:tc>
+          <w:tcPr>
+            <w:tcW w:type="dxa" w:w="500"/>
+            <w:tcMar>
+              <w:top w:type="dxa" w:w="100"/>
+              <w:left w:type="dxa" w:w="120"/>
+              <w:bottom w:type="dxa" w:w="100"/>
+              <w:right w:type="dxa" w:w="120"/>
+            </w:tcMar>
+          </w:tcPr>
+          <w:p>
+            <w:r>
+              <w:rPr>
+                <w:b/>
+                <w:bCs/>
+                <w:sz w:val="20"/>
+                <w:szCs w:val="20"/>
+              </w:rPr>
+              <w:t xml:space="preserve">10</w:t>
+            </w:r>
+          </w:p>
+        </w:tc>
+        <w:tc>
+          <w:tcPr>
+            <w:tcW w:type="dxa" w:w="4200"/>
+            <w:tcMar>
+              <w:top w:type="dxa" w:w="100"/>
+              <w:left w:type="dxa" w:w="120"/>
+              <w:bottom w:type="dxa" w:w="100"/>
+              <w:right w:type="dxa" w:w="120"/>
+            </w:tcMar>
+          </w:tcPr>
+          <w:p>
+            <w:pPr>
+              <w:spacing w:after="60"/>
+            </w:pPr>
+            <w:r>
+              <w:rPr>
+                <w:b/>
+                <w:bCs/>
+                <w:sz w:val="19"/>
+                <w:szCs w:val="19"/>
+              </w:rPr>
+              <w:t xml:space="preserve">David, H.A. &amp; Nagaraja, H.N. (2003)</w:t>
+            </w:r>
+          </w:p>
+          <w:p>
+            <w:pPr>
+              <w:spacing w:after="60"/>
+            </w:pPr>
+            <w:r>
+              <w:rPr>
+                <w:b w:val="false"/>
+                <w:bCs w:val="false"/>
+                <w:sz w:val="19"/>
+                <w:szCs w:val="19"/>
+              </w:rPr>
+              <w:t xml:space="preserve">Order Statistics (3e éd.), chapitre 5. Wiley.</w:t>
+            </w:r>
+          </w:p>
+        </w:tc>
+        <w:tc>
+          <w:tcPr>
+            <w:tcW w:type="dxa" w:w="3050"/>
+            <w:tcMar>
+              <w:top w:type="dxa" w:w="100"/>
+              <w:left w:type="dxa" w:w="120"/>
+              <w:bottom w:type="dxa" w:w="100"/>
+              <w:right w:type="dxa" w:w="120"/>
+            </w:tcMar>
+          </w:tcPr>
+          <w:p>
+            <w:pPr>
+              <w:spacing w:after="60"/>
+            </w:pPr>
+            <w:r>
+              <w:rPr>
+                <w:sz w:val="19"/>
+                <w:szCs w:val="19"/>
+              </w:rPr>
+              <w:t xml:space="preserve">Statistiques d'ordre SOUS DÉPENDANCE, bornes de Fréchet.</w:t>
+            </w:r>
+          </w:p>
+          <w:p>
+            <w:pPr>
+              <w:spacing w:after="60"/>
+            </w:pPr>
+            <w:r>
+              <w:rPr>
+                <w:sz w:val="19"/>
+                <w:szCs w:val="19"/>
+              </w:rPr>
+              <w:t xml:space="preserve">Cœur de la Question B (biais de l'hypothèse d'indépendance</w:t>
+            </w:r>
+          </w:p>
+          <w:p>
+            <w:pPr>
+              <w:spacing w:after="60"/>
+            </w:pPr>
+            <w:r>
+              <w:rPr>
+                <w:sz w:val="19"/>
+                <w:szCs w:val="19"/>
+              </w:rPr>
+              <w:t xml:space="preserve">sur le minimum des tau_i).</w:t>
+            </w:r>
+          </w:p>
+        </w:tc>
+        <w:tc>
+          <w:tcPr>
+            <w:tcW w:type="dxa" w:w="1600"/>
+            <w:tcMar>
+              <w:top w:type="dxa" w:w="100"/>
+              <w:left w:type="dxa" w:w="120"/>
+              <w:bottom w:type="dxa" w:w="100"/>
+              <w:right w:type="dxa" w:w="120"/>
+            </w:tcMar>
+          </w:tcPr>
+          <w:p>
+            <w:pPr>
+              <w:spacing w:after="60"/>
+            </w:pPr>
+            <w:r>
+              <w:rPr>
+                <w:b/>
+                <w:bCs/>
                 <w:color w:val="B03A2E"/>
                 <w:sz w:val="19"/>
                 <w:szCs w:val="19"/>
@@ -1174,603 +1701,7 @@
               <w:t xml:space="preserve">Payant — via BU
 </w:t>
             </w:r>
-            <w:r>
-              <w:rPr>
-                <w:i/>
-                <w:iCs/>
-                <w:sz w:val="17"/>
-                <w:szCs w:val="17"/>
-              </w:rPr>
-              <w:t xml:space="preserve">2 tentatives échouées : IEEE
-Xplore reader JS, page vide à
-chaque fois. Chercher le bouton
-PDF direct plutôt que la page
-reader.
-</w:t>
-            </w:r>
-            <w:hyperlink w:history="1" r:id="rIdzmr2wsvnnk4dxl_axy9ji">
-              <w:r>
-                <w:rPr>
-                  <w:rStyle w:val="Hyperlink"/>
-                </w:rPr>
-                <w:t xml:space="preserve">https://doi.org/10.1109/TKDE.2018.2876857</w:t>
-              </w:r>
-            </w:hyperlink>
-          </w:p>
-        </w:tc>
-      </w:tr>
-      <w:tr>
-        <w:tc>
-          <w:tcPr>
-            <w:tcW w:type="dxa" w:w="500"/>
-            <w:tcMar>
-              <w:top w:type="dxa" w:w="100"/>
-              <w:left w:type="dxa" w:w="120"/>
-              <w:bottom w:type="dxa" w:w="100"/>
-              <w:right w:type="dxa" w:w="120"/>
-            </w:tcMar>
-          </w:tcPr>
-          <w:p>
-            <w:r>
-              <w:rPr>
-                <w:b/>
-                <w:bCs/>
-                <w:sz w:val="20"/>
-                <w:szCs w:val="20"/>
-              </w:rPr>
-              <w:t xml:space="preserve">7</w:t>
-            </w:r>
-          </w:p>
-        </w:tc>
-        <w:tc>
-          <w:tcPr>
-            <w:tcW w:type="dxa" w:w="4200"/>
-            <w:tcMar>
-              <w:top w:type="dxa" w:w="100"/>
-              <w:left w:type="dxa" w:w="120"/>
-              <w:bottom w:type="dxa" w:w="100"/>
-              <w:right w:type="dxa" w:w="120"/>
-            </w:tcMar>
-          </w:tcPr>
-          <w:p>
-            <w:pPr>
-              <w:spacing w:after="60"/>
-            </w:pPr>
-            <w:r>
-              <w:rPr>
-                <w:b/>
-                <w:bCs/>
-                <w:sz w:val="19"/>
-                <w:szCs w:val="19"/>
-              </w:rPr>
-              <w:t xml:space="preserve">Raab, C., Heusinger, M. &amp; Schleif, F.-M. (2020)</w:t>
-            </w:r>
-          </w:p>
-          <w:p>
-            <w:pPr>
-              <w:spacing w:after="60"/>
-            </w:pPr>
-            <w:r>
-              <w:rPr>
-                <w:b w:val="false"/>
-                <w:bCs w:val="false"/>
-                <w:sz w:val="19"/>
-                <w:szCs w:val="19"/>
-              </w:rPr>
-              <w:t xml:space="preserve">Reactive Soft Prototype Computing for Concept Drift</w:t>
-            </w:r>
-          </w:p>
-          <w:p>
-            <w:pPr>
-              <w:spacing w:after="60"/>
-            </w:pPr>
-            <w:r>
-              <w:rPr>
-                <w:b w:val="false"/>
-                <w:bCs w:val="false"/>
-                <w:sz w:val="19"/>
-                <w:szCs w:val="19"/>
-              </w:rPr>
-              <w:t xml:space="preserve">Streams. Neurocomputing, 416, 340–351.</w:t>
-            </w:r>
-          </w:p>
-        </w:tc>
-        <w:tc>
-          <w:tcPr>
-            <w:tcW w:type="dxa" w:w="3050"/>
-            <w:tcMar>
-              <w:top w:type="dxa" w:w="100"/>
-              <w:left w:type="dxa" w:w="120"/>
-              <w:bottom w:type="dxa" w:w="100"/>
-              <w:right w:type="dxa" w:w="120"/>
-            </w:tcMar>
-          </w:tcPr>
-          <w:p>
-            <w:pPr>
-              <w:spacing w:after="60"/>
-            </w:pPr>
-            <w:r>
-              <w:rPr>
-                <w:sz w:val="19"/>
-                <w:szCs w:val="19"/>
-              </w:rPr>
-              <w:t xml:space="preserve">Méthode alternative de gestion du drift.</w:t>
-            </w:r>
-          </w:p>
-          <w:p>
-            <w:pPr>
-              <w:spacing w:after="60"/>
-            </w:pPr>
-            <w:r>
-              <w:rPr>
-                <w:sz w:val="19"/>
-                <w:szCs w:val="19"/>
-              </w:rPr>
-              <w:t xml:space="preserve">Contexte / comparaison possible, non critique.</w:t>
-            </w:r>
-          </w:p>
-        </w:tc>
-        <w:tc>
-          <w:tcPr>
-            <w:tcW w:type="dxa" w:w="1600"/>
-            <w:tcMar>
-              <w:top w:type="dxa" w:w="100"/>
-              <w:left w:type="dxa" w:w="120"/>
-              <w:bottom w:type="dxa" w:w="100"/>
-              <w:right w:type="dxa" w:w="120"/>
-            </w:tcMar>
-          </w:tcPr>
-          <w:p>
-            <w:pPr>
-              <w:spacing w:after="60"/>
-            </w:pPr>
-            <w:r>
-              <w:rPr>
-                <w:b/>
-                <w:bCs/>
-                <w:color w:val="B03A2E"/>
-                <w:sz w:val="19"/>
-                <w:szCs w:val="19"/>
-              </w:rPr>
-              <w:t xml:space="preserve">Payant — via BU
-</w:t>
-            </w:r>
-            <w:r>
-              <w:rPr>
-                <w:i/>
-                <w:iCs/>
-                <w:sz w:val="17"/>
-                <w:szCs w:val="17"/>
-              </w:rPr>
-              <w:t xml:space="preserve">2 tentatives échouées : ScienceDirect
-bloque systématiquement en
-vérification anti-bot. Essayer un
-autre réseau/navigateur, ou VPN
-bibliothèque.
-</w:t>
-            </w:r>
-            <w:hyperlink w:history="1" r:id="rIdp0gjlfesf8znkvknl0fgc">
-              <w:r>
-                <w:rPr>
-                  <w:rStyle w:val="Hyperlink"/>
-                </w:rPr>
-                <w:t xml:space="preserve">https://doi.org/10.1016/j.neucom.2019.11.111</w:t>
-              </w:r>
-            </w:hyperlink>
-          </w:p>
-        </w:tc>
-      </w:tr>
-      <w:tr>
-        <w:tc>
-          <w:tcPr>
-            <w:tcW w:type="dxa" w:w="500"/>
-            <w:tcMar>
-              <w:top w:type="dxa" w:w="100"/>
-              <w:left w:type="dxa" w:w="120"/>
-              <w:bottom w:type="dxa" w:w="100"/>
-              <w:right w:type="dxa" w:w="120"/>
-            </w:tcMar>
-          </w:tcPr>
-          <w:p>
-            <w:r>
-              <w:rPr>
-                <w:b/>
-                <w:bCs/>
-                <w:sz w:val="20"/>
-                <w:szCs w:val="20"/>
-              </w:rPr>
-              <w:t xml:space="preserve">8</w:t>
-            </w:r>
-          </w:p>
-        </w:tc>
-        <w:tc>
-          <w:tcPr>
-            <w:tcW w:type="dxa" w:w="4200"/>
-            <w:tcMar>
-              <w:top w:type="dxa" w:w="100"/>
-              <w:left w:type="dxa" w:w="120"/>
-              <w:bottom w:type="dxa" w:w="100"/>
-              <w:right w:type="dxa" w:w="120"/>
-            </w:tcMar>
-          </w:tcPr>
-          <w:p>
-            <w:pPr>
-              <w:spacing w:after="60"/>
-            </w:pPr>
-            <w:r>
-              <w:rPr>
-                <w:b/>
-                <w:bCs/>
-                <w:sz w:val="19"/>
-                <w:szCs w:val="19"/>
-              </w:rPr>
-              <w:t xml:space="preserve">Montiel, J. et al. (2021)</w:t>
-            </w:r>
-          </w:p>
-          <w:p>
-            <w:pPr>
-              <w:spacing w:after="60"/>
-            </w:pPr>
-            <w:r>
-              <w:rPr>
-                <w:b w:val="false"/>
-                <w:bCs w:val="false"/>
-                <w:sz w:val="19"/>
-                <w:szCs w:val="19"/>
-              </w:rPr>
-              <w:t xml:space="preserve">River: machine learning for streaming data in Python.</w:t>
-            </w:r>
-          </w:p>
-          <w:p>
-            <w:pPr>
-              <w:spacing w:after="60"/>
-            </w:pPr>
-            <w:r>
-              <w:rPr>
-                <w:b w:val="false"/>
-                <w:bCs w:val="false"/>
-                <w:sz w:val="19"/>
-                <w:szCs w:val="19"/>
-              </w:rPr>
-              <w:t xml:space="preserve">JMLR, 22.</w:t>
-            </w:r>
-          </w:p>
-        </w:tc>
-        <w:tc>
-          <w:tcPr>
-            <w:tcW w:type="dxa" w:w="3050"/>
-            <w:tcMar>
-              <w:top w:type="dxa" w:w="100"/>
-              <w:left w:type="dxa" w:w="120"/>
-              <w:bottom w:type="dxa" w:w="100"/>
-              <w:right w:type="dxa" w:w="120"/>
-            </w:tcMar>
-          </w:tcPr>
-          <w:p>
-            <w:pPr>
-              <w:spacing w:after="60"/>
-            </w:pPr>
-            <w:r>
-              <w:rPr>
-                <w:sz w:val="19"/>
-                <w:szCs w:val="19"/>
-              </w:rPr>
-              <w:t xml:space="preserve">Documentation de la librairie River,</w:t>
-            </w:r>
-          </w:p>
-          <w:p>
-            <w:pPr>
-              <w:spacing w:after="60"/>
-            </w:pPr>
-            <w:r>
-              <w:rPr>
-                <w:sz w:val="19"/>
-                <w:szCs w:val="19"/>
-              </w:rPr>
-              <w:t xml:space="preserve">outil imposé pour l'implémentation.</w:t>
-            </w:r>
-          </w:p>
-        </w:tc>
-        <w:tc>
-          <w:tcPr>
-            <w:tcW w:type="dxa" w:w="1600"/>
-            <w:tcMar>
-              <w:top w:type="dxa" w:w="100"/>
-              <w:left w:type="dxa" w:w="120"/>
-              <w:bottom w:type="dxa" w:w="100"/>
-              <w:right w:type="dxa" w:w="120"/>
-            </w:tcMar>
-          </w:tcPr>
-          <w:p>
-            <w:pPr>
-              <w:spacing w:after="60"/>
-            </w:pPr>
-            <w:r>
-              <w:rPr>
-                <w:b/>
-                <w:bCs/>
-                <w:color w:val="1B7A3C"/>
-                <w:sz w:val="19"/>
-                <w:szCs w:val="19"/>
-              </w:rPr>
-              <w:t xml:space="preserve">✓ Téléchargé</w:t>
-            </w:r>
-          </w:p>
-        </w:tc>
-      </w:tr>
-      <w:tr>
-        <w:tc>
-          <w:tcPr>
-            <w:tcW w:type="dxa" w:w="500"/>
-            <w:tcMar>
-              <w:top w:type="dxa" w:w="100"/>
-              <w:left w:type="dxa" w:w="120"/>
-              <w:bottom w:type="dxa" w:w="100"/>
-              <w:right w:type="dxa" w:w="120"/>
-            </w:tcMar>
-          </w:tcPr>
-          <w:p>
-            <w:r>
-              <w:rPr>
-                <w:b/>
-                <w:bCs/>
-                <w:sz w:val="20"/>
-                <w:szCs w:val="20"/>
-              </w:rPr>
-              <w:t xml:space="preserve">9</w:t>
-            </w:r>
-          </w:p>
-        </w:tc>
-        <w:tc>
-          <w:tcPr>
-            <w:tcW w:type="dxa" w:w="4200"/>
-            <w:tcMar>
-              <w:top w:type="dxa" w:w="100"/>
-              <w:left w:type="dxa" w:w="120"/>
-              <w:bottom w:type="dxa" w:w="100"/>
-              <w:right w:type="dxa" w:w="120"/>
-            </w:tcMar>
-          </w:tcPr>
-          <w:p>
-            <w:pPr>
-              <w:spacing w:after="60"/>
-            </w:pPr>
-            <w:r>
-              <w:rPr>
-                <w:b/>
-                <w:bCs/>
-                <w:sz w:val="19"/>
-                <w:szCs w:val="19"/>
-              </w:rPr>
-              <w:t xml:space="preserve">ProteuS (2025)</w:t>
-            </w:r>
-          </w:p>
-          <w:p>
-            <w:pPr>
-              <w:spacing w:after="60"/>
-            </w:pPr>
-            <w:r>
-              <w:rPr>
-                <w:b w:val="false"/>
-                <w:bCs w:val="false"/>
-                <w:sz w:val="19"/>
-                <w:szCs w:val="19"/>
-              </w:rPr>
-              <w:t xml:space="preserve">A Generative Approach for Simulating Concept Drift</w:t>
-            </w:r>
-          </w:p>
-          <w:p>
-            <w:pPr>
-              <w:spacing w:after="60"/>
-            </w:pPr>
-            <w:r>
-              <w:rPr>
-                <w:b w:val="false"/>
-                <w:bCs w:val="false"/>
-                <w:sz w:val="19"/>
-                <w:szCs w:val="19"/>
-              </w:rPr>
-              <w:t xml:space="preserve">in Financial Markets. arXiv:2509.11844.</w:t>
-            </w:r>
-          </w:p>
-        </w:tc>
-        <w:tc>
-          <w:tcPr>
-            <w:tcW w:type="dxa" w:w="3050"/>
-            <w:tcMar>
-              <w:top w:type="dxa" w:w="100"/>
-              <w:left w:type="dxa" w:w="120"/>
-              <w:bottom w:type="dxa" w:w="100"/>
-              <w:right w:type="dxa" w:w="120"/>
-            </w:tcMar>
-          </w:tcPr>
-          <w:p>
-            <w:pPr>
-              <w:spacing w:after="60"/>
-            </w:pPr>
-            <w:r>
-              <w:rPr>
-                <w:sz w:val="19"/>
-                <w:szCs w:val="19"/>
-              </w:rPr>
-              <w:t xml:space="preserve">Le générateur synthétique financier cité dans l'énoncé —</w:t>
-            </w:r>
-          </w:p>
-          <w:p>
-            <w:pPr>
-              <w:spacing w:after="60"/>
-            </w:pPr>
-            <w:r>
-              <w:rPr>
-                <w:sz w:val="19"/>
-                <w:szCs w:val="19"/>
-              </w:rPr>
-              <w:t xml:space="preserve">sert à tester le système sur des ruptures de régime connues.</w:t>
-            </w:r>
-          </w:p>
-        </w:tc>
-        <w:tc>
-          <w:tcPr>
-            <w:tcW w:type="dxa" w:w="1600"/>
-            <w:tcMar>
-              <w:top w:type="dxa" w:w="100"/>
-              <w:left w:type="dxa" w:w="120"/>
-              <w:bottom w:type="dxa" w:w="100"/>
-              <w:right w:type="dxa" w:w="120"/>
-            </w:tcMar>
-          </w:tcPr>
-          <w:p>
-            <w:pPr>
-              <w:spacing w:after="60"/>
-            </w:pPr>
-            <w:r>
-              <w:rPr>
-                <w:b/>
-                <w:bCs/>
-                <w:color w:val="1B7A3C"/>
-                <w:sz w:val="19"/>
-                <w:szCs w:val="19"/>
-              </w:rPr>
-              <w:t xml:space="preserve">✓ Téléchargé</w:t>
-            </w:r>
-          </w:p>
-        </w:tc>
-      </w:tr>
-      <w:tr>
-        <w:tc>
-          <w:tcPr>
-            <w:tcW w:type="dxa" w:w="500"/>
-            <w:tcMar>
-              <w:top w:type="dxa" w:w="100"/>
-              <w:left w:type="dxa" w:w="120"/>
-              <w:bottom w:type="dxa" w:w="100"/>
-              <w:right w:type="dxa" w:w="120"/>
-            </w:tcMar>
-          </w:tcPr>
-          <w:p>
-            <w:r>
-              <w:rPr>
-                <w:b/>
-                <w:bCs/>
-                <w:sz w:val="20"/>
-                <w:szCs w:val="20"/>
-              </w:rPr>
-              <w:t xml:space="preserve">10</w:t>
-            </w:r>
-          </w:p>
-        </w:tc>
-        <w:tc>
-          <w:tcPr>
-            <w:tcW w:type="dxa" w:w="4200"/>
-            <w:tcMar>
-              <w:top w:type="dxa" w:w="100"/>
-              <w:left w:type="dxa" w:w="120"/>
-              <w:bottom w:type="dxa" w:w="100"/>
-              <w:right w:type="dxa" w:w="120"/>
-            </w:tcMar>
-          </w:tcPr>
-          <w:p>
-            <w:pPr>
-              <w:spacing w:after="60"/>
-            </w:pPr>
-            <w:r>
-              <w:rPr>
-                <w:b/>
-                <w:bCs/>
-                <w:sz w:val="19"/>
-                <w:szCs w:val="19"/>
-              </w:rPr>
-              <w:t xml:space="preserve">David, H.A. &amp; Nagaraja, H.N. (2003)</w:t>
-            </w:r>
-          </w:p>
-          <w:p>
-            <w:pPr>
-              <w:spacing w:after="60"/>
-            </w:pPr>
-            <w:r>
-              <w:rPr>
-                <w:b w:val="false"/>
-                <w:bCs w:val="false"/>
-                <w:sz w:val="19"/>
-                <w:szCs w:val="19"/>
-              </w:rPr>
-              <w:t xml:space="preserve">Order Statistics (3e éd.), chapitre 5. Wiley.</w:t>
-            </w:r>
-          </w:p>
-        </w:tc>
-        <w:tc>
-          <w:tcPr>
-            <w:tcW w:type="dxa" w:w="3050"/>
-            <w:tcMar>
-              <w:top w:type="dxa" w:w="100"/>
-              <w:left w:type="dxa" w:w="120"/>
-              <w:bottom w:type="dxa" w:w="100"/>
-              <w:right w:type="dxa" w:w="120"/>
-            </w:tcMar>
-          </w:tcPr>
-          <w:p>
-            <w:pPr>
-              <w:spacing w:after="60"/>
-            </w:pPr>
-            <w:r>
-              <w:rPr>
-                <w:sz w:val="19"/>
-                <w:szCs w:val="19"/>
-              </w:rPr>
-              <w:t xml:space="preserve">Statistiques d'ordre SOUS DÉPENDANCE, bornes de Fréchet.</w:t>
-            </w:r>
-          </w:p>
-          <w:p>
-            <w:pPr>
-              <w:spacing w:after="60"/>
-            </w:pPr>
-            <w:r>
-              <w:rPr>
-                <w:sz w:val="19"/>
-                <w:szCs w:val="19"/>
-              </w:rPr>
-              <w:t xml:space="preserve">Cœur de la Question B (biais de l'hypothèse d'indépendance</w:t>
-            </w:r>
-          </w:p>
-          <w:p>
-            <w:pPr>
-              <w:spacing w:after="60"/>
-            </w:pPr>
-            <w:r>
-              <w:rPr>
-                <w:sz w:val="19"/>
-                <w:szCs w:val="19"/>
-              </w:rPr>
-              <w:t xml:space="preserve">sur le minimum des tau_i).</w:t>
-            </w:r>
-          </w:p>
-        </w:tc>
-        <w:tc>
-          <w:tcPr>
-            <w:tcW w:type="dxa" w:w="1600"/>
-            <w:tcMar>
-              <w:top w:type="dxa" w:w="100"/>
-              <w:left w:type="dxa" w:w="120"/>
-              <w:bottom w:type="dxa" w:w="100"/>
-              <w:right w:type="dxa" w:w="120"/>
-            </w:tcMar>
-          </w:tcPr>
-          <w:p>
-            <w:pPr>
-              <w:spacing w:after="60"/>
-            </w:pPr>
-            <w:r>
-              <w:rPr>
-                <w:b/>
-                <w:bCs/>
-                <w:color w:val="B03A2E"/>
-                <w:sz w:val="19"/>
-                <w:szCs w:val="19"/>
-              </w:rPr>
-              <w:t xml:space="preserve">Payant — via BU
-</w:t>
-            </w:r>
-            <w:hyperlink w:history="1" r:id="rIdzda63wgxkoj6idsyk3dle">
+            <w:hyperlink w:history="1" r:id="rIdbwwacnzdksk8gouqzhuk4">
               <w:r>
                 <w:rPr>
                   <w:rStyle w:val="Hyperlink"/>
@@ -2067,7 +1998,7 @@
               <w:t xml:space="preserve">Payant — via BU
 </w:t>
             </w:r>
-            <w:hyperlink w:history="1" r:id="rIdewb7oo1xxdodtvrwoaiis">
+            <w:hyperlink w:history="1" r:id="rIdwnvz-_pug9h2ykfoepxiv">
               <w:r>
                 <w:rPr>
                   <w:rStyle w:val="Hyperlink"/>

</xml_diff>

<commit_message>
Ajoute Bifet & Gavaldà 2007 (ADWIN) + corrige Mélaine->Melaine dans la biblio, 11/13 refs en main
</commit_message>
<xml_diff>
--- a/Biblio/Bibliographie_Sujet39.docx
+++ b/Biblio/Bibliographie_Sujet39.docx
@@ -36,7 +36,7 @@
           <w:sz w:val="19"/>
           <w:szCs w:val="19"/>
         </w:rPr>
-        <w:t xml:space="preserve">Filière Recherche · 3ème année · Groupe : Alexandre Boyer, Mélaine Gouillou, Salomé Fonvielle, Ulysse Petit-Tichanné</w:t>
+        <w:t xml:space="preserve">Filière Recherche · 3ème année · Groupe : Alexandre Boyer, Melaine Gouillou, Salomé Fonvielle, Ulysse Petit-Tichanné</w:t>
       </w:r>
     </w:p>
     <w:p>
@@ -48,7 +48,7 @@
           <w:sz w:val="19"/>
           <w:szCs w:val="19"/>
         </w:rPr>
-        <w:t xml:space="preserve">13 références (10 extraites du sujet officiel, dont 7 cachées derrière des hyperliens du PDF non visibles en texte brut ; 3 supplémentaires trouvées dans le document d'introduction "Le paradoxe du point aveugle"). 10 sont téléchargées et dans ce dossier (3 en libre accès + 7 récupérées via accès institutionnel). Ne restent que Bifet &amp; Gavaldà (pas encore tenté) et deux ouvrages (David &amp; Nagaraja, Kalbfleisch &amp; Prentice) qui demandent un emprunt bibliothèque plutôt qu'un téléchargement.</w:t>
+        <w:t xml:space="preserve">13 références (10 extraites du sujet officiel, dont 7 cachées derrière des hyperliens du PDF non visibles en texte brut ; 3 supplémentaires trouvées dans le document d'introduction "Le paradoxe du point aveugle"). 11 sont téléchargées et dans ce dossier (3 en libre accès + 8 récupérées via accès institutionnel). Ne restent que deux ouvrages (David &amp; Nagaraja, Kalbfleisch &amp; Prentice) qui demandent un emprunt bibliothèque plutôt qu'un téléchargement.</w:t>
       </w:r>
     </w:p>
     <w:tbl>
@@ -711,31 +711,12 @@
               <w:rPr>
                 <w:b/>
                 <w:bCs/>
-                <w:color w:val="B03A2E"/>
-                <w:sz w:val="19"/>
-                <w:szCs w:val="19"/>
-              </w:rPr>
-              <w:t xml:space="preserve">Payant — via BU
-</w:t>
-            </w:r>
-            <w:r>
-              <w:rPr>
-                <w:i/>
-                <w:iCs/>
-                <w:sz w:val="17"/>
-                <w:szCs w:val="17"/>
-              </w:rPr>
-              <w:t xml:space="preserve">Pas encore tenté.
-</w:t>
-            </w:r>
-            <w:hyperlink w:history="1" r:id="rIdclwskvpcx-u_-q7b8vc8c">
-              <w:r>
-                <w:rPr>
-                  <w:rStyle w:val="Hyperlink"/>
-                </w:rPr>
-                <w:t xml:space="preserve">https://doi.org/10.1137/1.9781611972771.42</w:t>
-              </w:r>
-            </w:hyperlink>
+                <w:color w:val="1B7A3C"/>
+                <w:sz w:val="19"/>
+                <w:szCs w:val="19"/>
+              </w:rPr>
+              <w:t xml:space="preserve">✓ Téléchargé</w:t>
+            </w:r>
           </w:p>
         </w:tc>
       </w:tr>

</xml_diff>